<commit_message>
v2.28: complete the 'setting entries' operations - CLI lock/--off and show --entries
- world_studio.py: new 'lock' subcommand (unlock with --off) and 'show --entries' listing
  entries as [state] id | kind | name (+lock)
- docs: README command block and World Studio guide updated
</commit_message>
<xml_diff>
--- a/docs/WorldStudio_新手引导.docx
+++ b/docs/WorldStudio_新手引导.docx
@@ -959,6 +959,72 @@
           </w:tcPr>
           <w:p>
             <w:r>
+              <w:t>show &lt;目录名&gt; --entries</w:t>
+            </w:r>
+          </w:p>
+        </w:tc>
+        <w:tc>
+          <w:tcPr>
+            <w:tcW w:type="dxa" w:w="4320"/>
+          </w:tcPr>
+          <w:p>
+            <w:r>
+              <w:t>列出全部条目（[状态] id｜类别｜名称＋锁定）</w:t>
+            </w:r>
+          </w:p>
+        </w:tc>
+      </w:tr>
+      <w:tr>
+        <w:tc>
+          <w:tcPr>
+            <w:tcW w:type="dxa" w:w="4320"/>
+          </w:tcPr>
+          <w:p>
+            <w:r>
+              <w:t>state &lt;目录名&gt; consequence-1 confirmed</w:t>
+            </w:r>
+          </w:p>
+        </w:tc>
+        <w:tc>
+          <w:tcPr>
+            <w:tcW w:type="dxa" w:w="4320"/>
+          </w:tcPr>
+          <w:p>
+            <w:r>
+              <w:t>设置条目状态</w:t>
+            </w:r>
+          </w:p>
+        </w:tc>
+      </w:tr>
+      <w:tr>
+        <w:tc>
+          <w:tcPr>
+            <w:tcW w:type="dxa" w:w="4320"/>
+          </w:tcPr>
+          <w:p>
+            <w:r>
+              <w:t>lock &lt;目录名&gt; rule-1 [--off]</w:t>
+            </w:r>
+          </w:p>
+        </w:tc>
+        <w:tc>
+          <w:tcPr>
+            <w:tcW w:type="dxa" w:w="4320"/>
+          </w:tcPr>
+          <w:p>
+            <w:r>
+              <w:t>锁定 / 解锁条目</w:t>
+            </w:r>
+          </w:p>
+        </w:tc>
+      </w:tr>
+      <w:tr>
+        <w:tc>
+          <w:tcPr>
+            <w:tcW w:type="dxa" w:w="4320"/>
+          </w:tcPr>
+          <w:p>
+            <w:r>
               <w:t>edit &lt;目录名&gt; rule-1 --statement "…" [--yes]</w:t>
             </w:r>
           </w:p>

</xml_diff>

<commit_message>
v2.30.1: graft source label includes the project folder (all files are named world.md)
- world_studio CLI/GUI: source_name defaults to '<folder>/<file>' (overridable with --name)
- guides: add a 'how to use grafting' section (import another project's world.md; seed = the new
  variable, source = the kept skeleton; pick the operator by intent)
- tests: _source_label (180 tests)
</commit_message>
<xml_diff>
--- a/docs/WorldStudio_新手引导.docx
+++ b/docs/WorldStudio_新手引导.docx
@@ -38,7 +38,7 @@
           <w:color w:val="999999"/>
           <w:sz w:val="22"/>
         </w:rPr>
-        <w:t>适用版本 v2.27　·　Novel Jazz Engine</w:t>
+        <w:t>适用版本 v2.30.1　·　Novel Jazz Engine</w:t>
       </w:r>
     </w:p>
     <w:p/>
@@ -566,6 +566,70 @@
       </w:pPr>
       <w:r>
         <w:t>嫁接以抽象规则与主题为材料，不复制原作的文字、人物与独特表达。</w:t>
+      </w:r>
+    </w:p>
+    <w:p>
+      <w:pPr>
+        <w:pStyle w:val="Heading2"/>
+      </w:pPr>
+      <w:r>
+        <w:t>典型用法（导入另一部作品 / 另一个项目的 world.md）</w:t>
+      </w:r>
+    </w:p>
+    <w:p>
+      <w:r>
+        <w:rPr>
+          <w:b w:val="0"/>
+        </w:rPr>
+        <w:t>把**另一个项目**的 world.md 作为来源导入，是嫁接最主要的用法。它读的是那份设定的**抽象骨架**（规则 / 主题 / 权力 / 历史 / 美学），据此派生出一个**新世界**，不改动来源文件。</w:t>
+      </w:r>
+    </w:p>
+    <w:p>
+      <w:pPr>
+        <w:pStyle w:val="ListBullet"/>
+      </w:pPr>
+      <w:r>
+        <w:t>深度变形：留住来源的核心规则，用你给的 seed 作为“新条件”，重新推导社会、历史与生活方式。（seed 是“新世界的新变量”，来源的规则是“保留的骨架”。）</w:t>
+      </w:r>
+    </w:p>
+    <w:p>
+      <w:pPr>
+        <w:pStyle w:val="ListBullet"/>
+      </w:pPr>
+      <w:r>
+        <w:t>主题移植：保住主题矛盾，换掉时代、制度、技术条件。</w:t>
+      </w:r>
+    </w:p>
+    <w:p>
+      <w:pPr>
+        <w:pStyle w:val="ListBullet"/>
+      </w:pPr>
+      <w:r>
+        <w:t>边缘扩展：留住来源底层逻辑，把镜头移向它没有重点写过的区域或时代。</w:t>
+      </w:r>
+    </w:p>
+    <w:p>
+      <w:pPr>
+        <w:pStyle w:val="ListBullet"/>
+      </w:pPr>
+      <w:r>
+        <w:t>反转前提：系统会给出多个具体反命题候选（如“任何人都可以…”“任何存在都无法…”），由你挑一个。</w:t>
+      </w:r>
+    </w:p>
+    <w:p>
+      <w:pPr>
+        <w:pStyle w:val="ListBullet"/>
+      </w:pPr>
+      <w:r>
+        <w:t>世界交叉：同时导入两份设定（--second），生成并存的两条规则并附调和裁决规则。</w:t>
+      </w:r>
+    </w:p>
+    <w:p>
+      <w:r>
+        <w:rPr>
+          <w:b w:val="0"/>
+        </w:rPr>
+        <w:t>来源标注会带上项目目录（如 来源：界河/world.md），方便回看“新世界从哪来”。也可以 --name 自定义来源名。导入后建议先看“嫁接变形记录”与“生成提示”（若有差异提示），再对自己认可的新增规则设状态 / 锁定，必要时用 edit 改写条目。</w:t>
       </w:r>
     </w:p>
     <w:p>

</xml_diff>